<commit_message>
Versión 2 del documento del proyecto: reglas de negocio y sección 9
- Nueva sección 6.3 con las reglas de negocio R-01 a R-09 surgidas en la
  implementación (R-08 y R-09 están propuestas, pendientes de aprobación).
- Secciones 9.1 y 9.2: enlaces del repositorio y del tablero, y capturas
  del 23/10/2026 (figuras 7 a 10: estructura, historial de commits,
  participación por cuenta y tablero).
- Sección 9.3: el backlog queda en la figura 10; falta la evidencia de al
  menos un sprint, porque el tablero no registra sprints.
- La portada indica la versión del documento y el PDF se exporta de nuevo.
</commit_message>
<xml_diff>
--- a/docs/Avance_de_proyecto_de_aula_Plataforma_de_Apoyo_Academico.docx
+++ b/docs/Avance_de_proyecto_de_aula_Plataforma_de_Apoyo_Academico.docx
@@ -330,6 +330,40 @@
                 <w:sz w:val="20"/>
               </w:rPr>
               <w:t>[Completar]</w:t>
+            </w:r>
+          </w:p>
+        </w:tc>
+      </w:tr>
+      <w:tr>
+        <w:tc>
+          <w:tcPr>
+            <w:tcW w:type="dxa" w:w="3312"/>
+            <w:shd w:val="clear" w:color="auto" w:fill="EAF0F6"/>
+          </w:tcPr>
+          <w:p>
+            <w:r/>
+            <w:r>
+              <w:rPr>
+                <w:b/>
+                <w:color w:val="1F3864"/>
+                <w:sz w:val="20"/>
+              </w:rPr>
+              <w:t>Versión del documento</w:t>
+            </w:r>
+          </w:p>
+        </w:tc>
+        <w:tc>
+          <w:tcPr>
+            <w:tcW w:type="dxa" w:w="5760"/>
+          </w:tcPr>
+          <w:p>
+            <w:r/>
+            <w:r>
+              <w:rPr>
+                <w:b w:val="0"/>
+                <w:sz w:val="20"/>
+              </w:rPr>
+              <w:t>2 (23 de octubre de 2026): agrega las reglas de negocio surgidas en la implementación (sección 6.3) y los enlaces y las capturas del repositorio y del tablero (sección 9). La versión 1 corresponde a la entrega del 18 de septiembre de 2026.</w:t>
             </w:r>
           </w:p>
         </w:tc>
@@ -4515,6 +4549,740 @@
     </w:tbl>
     <w:p>
       <w:pPr>
+        <w:pStyle w:val="Heading2"/>
+      </w:pPr>
+      <w:r>
+        <w:rPr>
+          <w:color w:val="1F4E5F"/>
+        </w:rPr>
+        <w:t>6.3 Reglas de negocio</w:t>
+      </w:r>
+    </w:p>
+    <w:p>
+      <w:pPr>
+        <w:spacing w:after="160" w:line="269" w:lineRule="auto"/>
+      </w:pPr>
+      <w:r>
+        <w:rPr>
+          <w:b w:val="0"/>
+          <w:i w:val="0"/>
+          <w:sz w:val="21"/>
+        </w:rPr>
+        <w:t xml:space="preserve">Durante la implementación del MVP aparecieron reglas que los requerimientos de las secciones 6.1 y 6.2 no definían. Se registran aquí, en la versión 2 del documento, para que los requerimientos sigan describiendo lo que hace el sistema y para que se revisen cuando cambie el requerimiento al que afectan.</w:t>
+      </w:r>
+    </w:p>
+    <w:tbl>
+      <w:tblPr>
+        <w:tblStyle w:val="TableGrid"/>
+        <w:tblW w:type="auto" w:w="0"/>
+        <w:jc w:val="center"/>
+        <w:tblLayout w:type="autofit"/>
+        <w:tblLook w:firstColumn="1" w:firstRow="1" w:lastColumn="0" w:lastRow="0" w:noHBand="0" w:noVBand="1" w:val="04A0"/>
+      </w:tblPr>
+      <w:tblGrid>
+        <w:gridCol w:w="792"/>
+        <w:gridCol w:w="6048"/>
+        <w:gridCol w:w="2232"/>
+        <w:gridCol w:w="2160"/>
+      </w:tblGrid>
+      <w:tr>
+        <w:trPr>
+          <w:tblHeader w:val="true"/>
+          <w:cantSplit/>
+        </w:trPr>
+        <w:tc>
+          <w:tcPr>
+            <w:tcW w:type="dxa" w:w="792"/>
+            <w:shd w:val="clear" w:color="auto" w:fill="1F4E5F"/>
+          </w:tcPr>
+          <w:p>
+            <w:r/>
+            <w:r>
+              <w:rPr>
+                <w:b/>
+                <w:color w:val="FFFFFF"/>
+                <w:sz w:val="17"/>
+              </w:rPr>
+              <w:t xml:space="preserve">ID</w:t>
+            </w:r>
+          </w:p>
+        </w:tc>
+        <w:tc>
+          <w:tcPr>
+            <w:tcW w:type="dxa" w:w="6048"/>
+            <w:shd w:val="clear" w:color="auto" w:fill="1F4E5F"/>
+          </w:tcPr>
+          <w:p>
+            <w:r/>
+            <w:r>
+              <w:rPr>
+                <w:b/>
+                <w:color w:val="FFFFFF"/>
+                <w:sz w:val="17"/>
+              </w:rPr>
+              <w:t xml:space="preserve">Regla</w:t>
+            </w:r>
+          </w:p>
+        </w:tc>
+        <w:tc>
+          <w:tcPr>
+            <w:tcW w:type="dxa" w:w="2232"/>
+            <w:shd w:val="clear" w:color="auto" w:fill="1F4E5F"/>
+          </w:tcPr>
+          <w:p>
+            <w:r/>
+            <w:r>
+              <w:rPr>
+                <w:b/>
+                <w:color w:val="FFFFFF"/>
+                <w:sz w:val="17"/>
+              </w:rPr>
+              <w:t xml:space="preserve">Origen</w:t>
+            </w:r>
+          </w:p>
+        </w:tc>
+        <w:tc>
+          <w:tcPr>
+            <w:tcW w:type="dxa" w:w="2160"/>
+            <w:shd w:val="clear" w:color="auto" w:fill="1F4E5F"/>
+          </w:tcPr>
+          <w:p>
+            <w:r/>
+            <w:r>
+              <w:rPr>
+                <w:b/>
+                <w:color w:val="FFFFFF"/>
+                <w:sz w:val="17"/>
+              </w:rPr>
+              <w:t xml:space="preserve">Afecta a</w:t>
+            </w:r>
+          </w:p>
+        </w:tc>
+      </w:tr>
+      <w:tr>
+        <w:trPr>
+          <w:cantSplit/>
+        </w:trPr>
+        <w:tc>
+          <w:tcPr>
+            <w:tcW w:type="dxa" w:w="792"/>
+            <w:shd w:val="clear" w:color="auto" w:fill="DCE6F1"/>
+          </w:tcPr>
+          <w:p>
+            <w:r/>
+            <w:r>
+              <w:rPr>
+                <w:b w:val="0"/>
+                <w:sz w:val="17"/>
+              </w:rPr>
+              <w:t xml:space="preserve">R-01</w:t>
+            </w:r>
+          </w:p>
+        </w:tc>
+        <w:tc>
+          <w:tcPr>
+            <w:tcW w:type="dxa" w:w="6048"/>
+            <w:shd w:val="clear" w:color="auto" w:fill="DCE6F1"/>
+          </w:tcPr>
+          <w:p>
+            <w:r/>
+            <w:r>
+              <w:rPr>
+                <w:b w:val="0"/>
+                <w:sz w:val="17"/>
+              </w:rPr>
+              <w:t xml:space="preserve">Al cerrar el último reporte pendiente de un material, este vuelve a «publicado»; si un reporte se reabre, vuelve a «reportado». Los estados que el administrador fija a mano («en revisión», «retirado») no cambian al cerrar reportes.</w:t>
+            </w:r>
+          </w:p>
+        </w:tc>
+        <w:tc>
+          <w:tcPr>
+            <w:tcW w:type="dxa" w:w="2232"/>
+            <w:shd w:val="clear" w:color="auto" w:fill="DCE6F1"/>
+          </w:tcPr>
+          <w:p>
+            <w:r/>
+            <w:r>
+              <w:rPr>
+                <w:b w:val="0"/>
+                <w:sz w:val="17"/>
+              </w:rPr>
+              <w:t xml:space="preserve">Defecto D-03 de la prueba del MVP</w:t>
+            </w:r>
+          </w:p>
+        </w:tc>
+        <w:tc>
+          <w:tcPr>
+            <w:tcW w:type="dxa" w:w="2160"/>
+            <w:shd w:val="clear" w:color="auto" w:fill="DCE6F1"/>
+          </w:tcPr>
+          <w:p>
+            <w:r/>
+            <w:r>
+              <w:rPr>
+                <w:b w:val="0"/>
+                <w:sz w:val="17"/>
+              </w:rPr>
+              <w:t xml:space="preserve">RF-10, RNF-05</w:t>
+            </w:r>
+          </w:p>
+        </w:tc>
+      </w:tr>
+      <w:tr>
+        <w:trPr>
+          <w:cantSplit/>
+        </w:trPr>
+        <w:tc>
+          <w:tcPr>
+            <w:tcW w:type="dxa" w:w="792"/>
+            <w:shd w:val="clear" w:color="auto" w:fill="FFFFFF"/>
+          </w:tcPr>
+          <w:p>
+            <w:r/>
+            <w:r>
+              <w:rPr>
+                <w:b w:val="0"/>
+                <w:sz w:val="17"/>
+              </w:rPr>
+              <w:t xml:space="preserve">R-02</w:t>
+            </w:r>
+          </w:p>
+        </w:tc>
+        <w:tc>
+          <w:tcPr>
+            <w:tcW w:type="dxa" w:w="6048"/>
+            <w:shd w:val="clear" w:color="auto" w:fill="FFFFFF"/>
+          </w:tcPr>
+          <w:p>
+            <w:r/>
+            <w:r>
+              <w:rPr>
+                <w:b w:val="0"/>
+                <w:sz w:val="17"/>
+              </w:rPr>
+              <w:t xml:space="preserve">Solo se aceptan archivos PDF, PNG, JPG/JPEG, DOC/DOCX y ZIP, de hasta 25 MB. El tipo se valida por la extensión del archivo, y el formulario de carga lo indica junto al botón del archivo.</w:t>
+            </w:r>
+          </w:p>
+        </w:tc>
+        <w:tc>
+          <w:tcPr>
+            <w:tcW w:type="dxa" w:w="2232"/>
+            <w:shd w:val="clear" w:color="auto" w:fill="FFFFFF"/>
+          </w:tcPr>
+          <w:p>
+            <w:r/>
+            <w:r>
+              <w:rPr>
+                <w:b w:val="0"/>
+                <w:sz w:val="17"/>
+              </w:rPr>
+              <w:t xml:space="preserve">Defecto D-01 de la prueba del MVP</w:t>
+            </w:r>
+          </w:p>
+        </w:tc>
+        <w:tc>
+          <w:tcPr>
+            <w:tcW w:type="dxa" w:w="2160"/>
+            <w:shd w:val="clear" w:color="auto" w:fill="FFFFFF"/>
+          </w:tcPr>
+          <w:p>
+            <w:r/>
+            <w:r>
+              <w:rPr>
+                <w:b w:val="0"/>
+                <w:sz w:val="17"/>
+              </w:rPr>
+              <w:t xml:space="preserve">RF-06, RF-12</w:t>
+            </w:r>
+          </w:p>
+        </w:tc>
+      </w:tr>
+      <w:tr>
+        <w:trPr>
+          <w:cantSplit/>
+        </w:trPr>
+        <w:tc>
+          <w:tcPr>
+            <w:tcW w:type="dxa" w:w="792"/>
+            <w:shd w:val="clear" w:color="auto" w:fill="DCE6F1"/>
+          </w:tcPr>
+          <w:p>
+            <w:r/>
+            <w:r>
+              <w:rPr>
+                <w:b w:val="0"/>
+                <w:sz w:val="17"/>
+              </w:rPr>
+              <w:t xml:space="preserve">R-03</w:t>
+            </w:r>
+          </w:p>
+        </w:tc>
+        <w:tc>
+          <w:tcPr>
+            <w:tcW w:type="dxa" w:w="6048"/>
+            <w:shd w:val="clear" w:color="auto" w:fill="DCE6F1"/>
+          </w:tcPr>
+          <w:p>
+            <w:r/>
+            <w:r>
+              <w:rPr>
+                <w:b w:val="0"/>
+                <w:sz w:val="17"/>
+              </w:rPr>
+              <w:t xml:space="preserve">El registro exige nombre, correo y una contraseña de 8 caracteres o más.</w:t>
+            </w:r>
+          </w:p>
+        </w:tc>
+        <w:tc>
+          <w:tcPr>
+            <w:tcW w:type="dxa" w:w="2232"/>
+            <w:shd w:val="clear" w:color="auto" w:fill="DCE6F1"/>
+          </w:tcPr>
+          <w:p>
+            <w:r/>
+            <w:r>
+              <w:rPr>
+                <w:b w:val="0"/>
+                <w:sz w:val="17"/>
+              </w:rPr>
+              <w:t xml:space="preserve">Implementación de RF-01</w:t>
+            </w:r>
+          </w:p>
+        </w:tc>
+        <w:tc>
+          <w:tcPr>
+            <w:tcW w:type="dxa" w:w="2160"/>
+            <w:shd w:val="clear" w:color="auto" w:fill="DCE6F1"/>
+          </w:tcPr>
+          <w:p>
+            <w:r/>
+            <w:r>
+              <w:rPr>
+                <w:b w:val="0"/>
+                <w:sz w:val="17"/>
+              </w:rPr>
+              <w:t xml:space="preserve">RF-01, RNF-04</w:t>
+            </w:r>
+          </w:p>
+        </w:tc>
+      </w:tr>
+      <w:tr>
+        <w:trPr>
+          <w:cantSplit/>
+        </w:trPr>
+        <w:tc>
+          <w:tcPr>
+            <w:tcW w:type="dxa" w:w="792"/>
+            <w:shd w:val="clear" w:color="auto" w:fill="FFFFFF"/>
+          </w:tcPr>
+          <w:p>
+            <w:r/>
+            <w:r>
+              <w:rPr>
+                <w:b w:val="0"/>
+                <w:sz w:val="17"/>
+              </w:rPr>
+              <w:t xml:space="preserve">R-04</w:t>
+            </w:r>
+          </w:p>
+        </w:tc>
+        <w:tc>
+          <w:tcPr>
+            <w:tcW w:type="dxa" w:w="6048"/>
+            <w:shd w:val="clear" w:color="auto" w:fill="FFFFFF"/>
+          </w:tcPr>
+          <w:p>
+            <w:r/>
+            <w:r>
+              <w:rPr>
+                <w:b w:val="0"/>
+                <w:sz w:val="17"/>
+              </w:rPr>
+              <w:t xml:space="preserve">El registro público solo crea cuentas de estudiante; el primer administrador se crea con el comando npm run crear-admin.</w:t>
+            </w:r>
+          </w:p>
+        </w:tc>
+        <w:tc>
+          <w:tcPr>
+            <w:tcW w:type="dxa" w:w="2232"/>
+            <w:shd w:val="clear" w:color="auto" w:fill="FFFFFF"/>
+          </w:tcPr>
+          <w:p>
+            <w:r/>
+            <w:r>
+              <w:rPr>
+                <w:b w:val="0"/>
+                <w:sz w:val="17"/>
+              </w:rPr>
+              <w:t xml:space="preserve">Implementación de RF-13</w:t>
+            </w:r>
+          </w:p>
+        </w:tc>
+        <w:tc>
+          <w:tcPr>
+            <w:tcW w:type="dxa" w:w="2160"/>
+            <w:shd w:val="clear" w:color="auto" w:fill="FFFFFF"/>
+          </w:tcPr>
+          <w:p>
+            <w:r/>
+            <w:r>
+              <w:rPr>
+                <w:b w:val="0"/>
+                <w:sz w:val="17"/>
+              </w:rPr>
+              <w:t xml:space="preserve">RF-01, RF-13</w:t>
+            </w:r>
+          </w:p>
+        </w:tc>
+      </w:tr>
+      <w:tr>
+        <w:trPr>
+          <w:cantSplit/>
+        </w:trPr>
+        <w:tc>
+          <w:tcPr>
+            <w:tcW w:type="dxa" w:w="792"/>
+            <w:shd w:val="clear" w:color="auto" w:fill="DCE6F1"/>
+          </w:tcPr>
+          <w:p>
+            <w:r/>
+            <w:r>
+              <w:rPr>
+                <w:b w:val="0"/>
+                <w:sz w:val="17"/>
+              </w:rPr>
+              <w:t xml:space="preserve">R-05</w:t>
+            </w:r>
+          </w:p>
+        </w:tc>
+        <w:tc>
+          <w:tcPr>
+            <w:tcW w:type="dxa" w:w="6048"/>
+            <w:shd w:val="clear" w:color="auto" w:fill="DCE6F1"/>
+          </w:tcPr>
+          <w:p>
+            <w:r/>
+            <w:r>
+              <w:rPr>
+                <w:b w:val="0"/>
+                <w:sz w:val="17"/>
+              </w:rPr>
+              <w:t xml:space="preserve">El administrador no puede desactivarse ni quitarse el rol de administrador a sí mismo, para que la plataforma no quede sin administrador.</w:t>
+            </w:r>
+          </w:p>
+        </w:tc>
+        <w:tc>
+          <w:tcPr>
+            <w:tcW w:type="dxa" w:w="2232"/>
+            <w:shd w:val="clear" w:color="auto" w:fill="DCE6F1"/>
+          </w:tcPr>
+          <w:p>
+            <w:r/>
+            <w:r>
+              <w:rPr>
+                <w:b w:val="0"/>
+                <w:sz w:val="17"/>
+              </w:rPr>
+              <w:t xml:space="preserve">Implementación de RF-13</w:t>
+            </w:r>
+          </w:p>
+        </w:tc>
+        <w:tc>
+          <w:tcPr>
+            <w:tcW w:type="dxa" w:w="2160"/>
+            <w:shd w:val="clear" w:color="auto" w:fill="DCE6F1"/>
+          </w:tcPr>
+          <w:p>
+            <w:r/>
+            <w:r>
+              <w:rPr>
+                <w:b w:val="0"/>
+                <w:sz w:val="17"/>
+              </w:rPr>
+              <w:t xml:space="preserve">RF-13</w:t>
+            </w:r>
+          </w:p>
+        </w:tc>
+      </w:tr>
+      <w:tr>
+        <w:trPr>
+          <w:cantSplit/>
+        </w:trPr>
+        <w:tc>
+          <w:tcPr>
+            <w:tcW w:type="dxa" w:w="792"/>
+            <w:shd w:val="clear" w:color="auto" w:fill="FFFFFF"/>
+          </w:tcPr>
+          <w:p>
+            <w:r/>
+            <w:r>
+              <w:rPr>
+                <w:b w:val="0"/>
+                <w:sz w:val="17"/>
+              </w:rPr>
+              <w:t xml:space="preserve">R-06</w:t>
+            </w:r>
+          </w:p>
+        </w:tc>
+        <w:tc>
+          <w:tcPr>
+            <w:tcW w:type="dxa" w:w="6048"/>
+            <w:shd w:val="clear" w:color="auto" w:fill="FFFFFF"/>
+          </w:tcPr>
+          <w:p>
+            <w:r/>
+            <w:r>
+              <w:rPr>
+                <w:b w:val="0"/>
+                <w:sz w:val="17"/>
+              </w:rPr>
+              <w:t xml:space="preserve">Una asignatura desactivada no aparece en el buscador ni admite material nuevo; su material existente se conserva.</w:t>
+            </w:r>
+          </w:p>
+        </w:tc>
+        <w:tc>
+          <w:tcPr>
+            <w:tcW w:type="dxa" w:w="2232"/>
+            <w:shd w:val="clear" w:color="auto" w:fill="FFFFFF"/>
+          </w:tcPr>
+          <w:p>
+            <w:r/>
+            <w:r>
+              <w:rPr>
+                <w:b w:val="0"/>
+                <w:sz w:val="17"/>
+              </w:rPr>
+              <w:t xml:space="preserve">Implementación de RF-13</w:t>
+            </w:r>
+          </w:p>
+        </w:tc>
+        <w:tc>
+          <w:tcPr>
+            <w:tcW w:type="dxa" w:w="2160"/>
+            <w:shd w:val="clear" w:color="auto" w:fill="FFFFFF"/>
+          </w:tcPr>
+          <w:p>
+            <w:r/>
+            <w:r>
+              <w:rPr>
+                <w:b w:val="0"/>
+                <w:sz w:val="17"/>
+              </w:rPr>
+              <w:t xml:space="preserve">RF-03, RF-13</w:t>
+            </w:r>
+          </w:p>
+        </w:tc>
+      </w:tr>
+      <w:tr>
+        <w:trPr>
+          <w:cantSplit/>
+        </w:trPr>
+        <w:tc>
+          <w:tcPr>
+            <w:tcW w:type="dxa" w:w="792"/>
+            <w:shd w:val="clear" w:color="auto" w:fill="DCE6F1"/>
+          </w:tcPr>
+          <w:p>
+            <w:r/>
+            <w:r>
+              <w:rPr>
+                <w:b w:val="0"/>
+                <w:sz w:val="17"/>
+              </w:rPr>
+              <w:t xml:space="preserve">R-07</w:t>
+            </w:r>
+          </w:p>
+        </w:tc>
+        <w:tc>
+          <w:tcPr>
+            <w:tcW w:type="dxa" w:w="6048"/>
+            <w:shd w:val="clear" w:color="auto" w:fill="DCE6F1"/>
+          </w:tcPr>
+          <w:p>
+            <w:r/>
+            <w:r>
+              <w:rPr>
+                <w:b w:val="0"/>
+                <w:sz w:val="17"/>
+              </w:rPr>
+              <w:t xml:space="preserve">Una cuenta desactivada o con el rol cambiado conserva su sesión ya iniciada hasta que vence el token (8 horas). Es un riesgo de seguridad aceptado de forma temporal.</w:t>
+            </w:r>
+          </w:p>
+        </w:tc>
+        <w:tc>
+          <w:tcPr>
+            <w:tcW w:type="dxa" w:w="2232"/>
+            <w:shd w:val="clear" w:color="auto" w:fill="DCE6F1"/>
+          </w:tcPr>
+          <w:p>
+            <w:r/>
+            <w:r>
+              <w:rPr>
+                <w:b w:val="0"/>
+                <w:sz w:val="17"/>
+              </w:rPr>
+              <w:t xml:space="preserve">Diseño de la API (JWT)</w:t>
+            </w:r>
+          </w:p>
+        </w:tc>
+        <w:tc>
+          <w:tcPr>
+            <w:tcW w:type="dxa" w:w="2160"/>
+            <w:shd w:val="clear" w:color="auto" w:fill="DCE6F1"/>
+          </w:tcPr>
+          <w:p>
+            <w:r/>
+            <w:r>
+              <w:rPr>
+                <w:b w:val="0"/>
+                <w:sz w:val="17"/>
+              </w:rPr>
+              <w:t xml:space="preserve">RF-13, RNF-04</w:t>
+            </w:r>
+          </w:p>
+        </w:tc>
+      </w:tr>
+      <w:tr>
+        <w:trPr>
+          <w:cantSplit/>
+        </w:trPr>
+        <w:tc>
+          <w:tcPr>
+            <w:tcW w:type="dxa" w:w="792"/>
+            <w:shd w:val="clear" w:color="auto" w:fill="FFFFFF"/>
+          </w:tcPr>
+          <w:p>
+            <w:r/>
+            <w:r>
+              <w:rPr>
+                <w:b w:val="0"/>
+                <w:sz w:val="17"/>
+              </w:rPr>
+              <w:t xml:space="preserve">R-08</w:t>
+            </w:r>
+          </w:p>
+        </w:tc>
+        <w:tc>
+          <w:tcPr>
+            <w:tcW w:type="dxa" w:w="6048"/>
+            <w:shd w:val="clear" w:color="auto" w:fill="FFFFFF"/>
+          </w:tcPr>
+          <w:p>
+            <w:r/>
+            <w:r>
+              <w:rPr>
+                <w:b w:val="0"/>
+                <w:sz w:val="17"/>
+              </w:rPr>
+              <w:t xml:space="preserve">El nombre de quien sube un material anónimo no se muestra a ningún usuario, tampoco al administrador; la base de datos conserva el vínculo con la cuenta.</w:t>
+            </w:r>
+          </w:p>
+        </w:tc>
+        <w:tc>
+          <w:tcPr>
+            <w:tcW w:type="dxa" w:w="2232"/>
+            <w:shd w:val="clear" w:color="auto" w:fill="FFFFFF"/>
+          </w:tcPr>
+          <w:p>
+            <w:r/>
+            <w:r>
+              <w:rPr>
+                <w:b w:val="0"/>
+                <w:sz w:val="17"/>
+              </w:rPr>
+              <w:t xml:space="preserve">Implementación de RF-07</w:t>
+            </w:r>
+          </w:p>
+        </w:tc>
+        <w:tc>
+          <w:tcPr>
+            <w:tcW w:type="dxa" w:w="2160"/>
+            <w:shd w:val="clear" w:color="auto" w:fill="FFFFFF"/>
+          </w:tcPr>
+          <w:p>
+            <w:r/>
+            <w:r>
+              <w:rPr>
+                <w:b w:val="0"/>
+                <w:sz w:val="17"/>
+              </w:rPr>
+              <w:t xml:space="preserve">RF-07, RF-12</w:t>
+            </w:r>
+          </w:p>
+        </w:tc>
+      </w:tr>
+      <w:tr>
+        <w:trPr>
+          <w:cantSplit/>
+        </w:trPr>
+        <w:tc>
+          <w:tcPr>
+            <w:tcW w:type="dxa" w:w="792"/>
+            <w:shd w:val="clear" w:color="auto" w:fill="DCE6F1"/>
+          </w:tcPr>
+          <w:p>
+            <w:r/>
+            <w:r>
+              <w:rPr>
+                <w:b w:val="0"/>
+                <w:sz w:val="17"/>
+              </w:rPr>
+              <w:t xml:space="preserve">R-09</w:t>
+            </w:r>
+          </w:p>
+        </w:tc>
+        <w:tc>
+          <w:tcPr>
+            <w:tcW w:type="dxa" w:w="6048"/>
+            <w:shd w:val="clear" w:color="auto" w:fill="DCE6F1"/>
+          </w:tcPr>
+          <w:p>
+            <w:r/>
+            <w:r>
+              <w:rPr>
+                <w:b w:val="0"/>
+                <w:sz w:val="17"/>
+              </w:rPr>
+              <w:t xml:space="preserve">La búsqueda por texto busca cada palabra en el título, la descripción y el nombre o código de la asignatura, sin distinguir tildes ni mayúsculas. Un material aparece si contiene todas las palabras buscadas.</w:t>
+            </w:r>
+          </w:p>
+        </w:tc>
+        <w:tc>
+          <w:tcPr>
+            <w:tcW w:type="dxa" w:w="2232"/>
+            <w:shd w:val="clear" w:color="auto" w:fill="DCE6F1"/>
+          </w:tcPr>
+          <w:p>
+            <w:r/>
+            <w:r>
+              <w:rPr>
+                <w:b w:val="0"/>
+                <w:sz w:val="17"/>
+              </w:rPr>
+              <w:t xml:space="preserve">Ajustes de usabilidad H-01 y H-02</w:t>
+            </w:r>
+          </w:p>
+        </w:tc>
+        <w:tc>
+          <w:tcPr>
+            <w:tcW w:type="dxa" w:w="2160"/>
+            <w:shd w:val="clear" w:color="auto" w:fill="DCE6F1"/>
+          </w:tcPr>
+          <w:p>
+            <w:r/>
+            <w:r>
+              <w:rPr>
+                <w:b w:val="0"/>
+                <w:sz w:val="17"/>
+              </w:rPr>
+              <w:t xml:space="preserve">RF-03, RF-04</w:t>
+            </w:r>
+          </w:p>
+        </w:tc>
+      </w:tr>
+    </w:tbl>
+    <w:p>
+      <w:pPr>
         <w:pStyle w:val="Heading1"/>
       </w:pPr>
       <w:r>
@@ -5697,7 +6465,7 @@
                 <w:i/>
                 <w:sz w:val="19"/>
               </w:rPr>
-              <w:t>El equipo indicó que el repositorio de GitHub y el tablero de gestión aún no están configurados. Esta sección se entrega como plantilla lista para completar: la sustentación de la metodología ágil ya está redactada; los campos entre [Completar] deben diligenciarse con los enlaces y capturas reales antes de la entrega final.</w:t>
+              <w:t>El repositorio de GitHub y el tablero de gestión ya están configurados; sus enlaces están en las secciones 9.1 y 9.2 y sus capturas en las figuras 7 a 10. Falta la evidencia de al menos un sprint (sección 9.3), que el equipo debe agregar antes de la entrega final.</w:t>
             </w:r>
           </w:p>
         </w:tc>
@@ -5803,7 +6571,7 @@
                 <w:b w:val="0"/>
                 <w:sz w:val="19"/>
               </w:rPr>
-              <w:t>[Completar — URL de GitHub, con acceso habilitado para el docente si es privado]</w:t>
+              <w:t>https://github.com/jaimeutb/Project_1 (repositorio público, rama main)</w:t>
             </w:r>
           </w:p>
         </w:tc>
@@ -5824,7 +6592,7 @@
                 <w:b w:val="0"/>
                 <w:sz w:val="19"/>
               </w:rPr>
-              <w:t>Estructura sugerida</w:t>
+              <w:t>Estructura del repositorio</w:t>
             </w:r>
           </w:p>
         </w:tc>
@@ -5840,7 +6608,7 @@
                 <w:b w:val="0"/>
                 <w:sz w:val="19"/>
               </w:rPr>
-              <w:t>/frontend (aplicación Flutter Web) · /backend (API) · /docs (documento del proyecto, diagramas, evidencias) · README.md con la descripción del proyecto y las instrucciones para ejecutarlo.</w:t>
+              <w:t>/frontend (aplicación Flutter Web, con sus pruebas de widgets) · /backend (API REST en Node.js y Express, con sus pruebas) · /docs (documento del proyecto, diagramas y evidencias) · tablero.html (tablero de gestión, sección 9.2) · README.md con la descripción del proyecto y las instrucciones para ejecutarlo y probarlo.</w:t>
             </w:r>
           </w:p>
         </w:tc>
@@ -5914,12 +6682,177 @@
                 <w:b w:val="0"/>
                 <w:sz w:val="19"/>
               </w:rPr>
-              <w:t>[Completar — capturas de la estructura del repositorio, del historial de confirmaciones y de la participación de ambos integrantes]</w:t>
+              <w:t>Figuras 7 (estructura), 8 (historial de confirmaciones) y 9 (participación de los integrantes).</w:t>
             </w:r>
           </w:p>
         </w:tc>
       </w:tr>
     </w:tbl>
+    <w:p>
+      <w:pPr>
+        <w:keepNext/>
+        <w:spacing w:before="120"/>
+        <w:jc w:val="center"/>
+      </w:pPr>
+      <w:r>
+        <w:drawing>
+          <wp:inline xmlns:a="http://schemas.openxmlformats.org/drawingml/2006/main" xmlns:pic="http://schemas.openxmlformats.org/drawingml/2006/picture">
+            <wp:extent cx="5669280" cy="3886200"/>
+            <wp:docPr id="9" name="Picture 9"/>
+            <wp:cNvGraphicFramePr>
+              <a:graphicFrameLocks noChangeAspect="1"/>
+            </wp:cNvGraphicFramePr>
+            <a:graphic>
+              <a:graphicData uri="http://schemas.openxmlformats.org/drawingml/2006/picture">
+                <pic:pic>
+                  <pic:nvPicPr>
+                    <pic:cNvPr id="0" name="repo_rec.png"/>
+                    <pic:cNvPicPr/>
+                  </pic:nvPicPr>
+                  <pic:blipFill>
+                    <a:blip r:embed="rId17"/>
+                    <a:stretch>
+                      <a:fillRect/>
+                    </a:stretch>
+                  </pic:blipFill>
+                  <pic:spPr>
+                    <a:xfrm>
+                      <a:off x="0" y="0"/>
+                      <a:ext cx="5669280" cy="3886200"/>
+                    </a:xfrm>
+                    <a:prstGeom prst="rect"/>
+                  </pic:spPr>
+                </pic:pic>
+              </a:graphicData>
+            </a:graphic>
+          </wp:inline>
+        </w:drawing>
+      </w:r>
+    </w:p>
+    <w:p>
+      <w:pPr>
+        <w:spacing w:after="200"/>
+        <w:jc w:val="center"/>
+      </w:pPr>
+      <w:r>
+        <w:rPr>
+          <w:i/>
+          <w:color w:val="666666"/>
+          <w:sz w:val="18"/>
+        </w:rPr>
+        <w:t xml:space="preserve">Figura 7. Repositorio jaimeutb/Project_1 en GitHub: carpetas backend, docs y frontend, el tablero (tablero.html) y las cuentas que han contribuido. Captura del 23 de octubre de 2026.</w:t>
+      </w:r>
+    </w:p>
+    <w:p>
+      <w:pPr>
+        <w:keepNext/>
+        <w:spacing w:before="120"/>
+        <w:jc w:val="center"/>
+      </w:pPr>
+      <w:r>
+        <w:drawing>
+          <wp:inline xmlns:a="http://schemas.openxmlformats.org/drawingml/2006/main" xmlns:pic="http://schemas.openxmlformats.org/drawingml/2006/picture">
+            <wp:extent cx="5669280" cy="5067993"/>
+            <wp:docPr id="10" name="Picture 10"/>
+            <wp:cNvGraphicFramePr>
+              <a:graphicFrameLocks noChangeAspect="1"/>
+            </wp:cNvGraphicFramePr>
+            <a:graphic>
+              <a:graphicData uri="http://schemas.openxmlformats.org/drawingml/2006/picture">
+                <pic:pic>
+                  <pic:nvPicPr>
+                    <pic:cNvPr id="0" name="commits_rec.png"/>
+                    <pic:cNvPicPr/>
+                  </pic:nvPicPr>
+                  <pic:blipFill>
+                    <a:blip r:embed="rId18"/>
+                    <a:stretch>
+                      <a:fillRect/>
+                    </a:stretch>
+                  </pic:blipFill>
+                  <pic:spPr>
+                    <a:xfrm>
+                      <a:off x="0" y="0"/>
+                      <a:ext cx="5669280" cy="5067993"/>
+                    </a:xfrm>
+                    <a:prstGeom prst="rect"/>
+                  </pic:spPr>
+                </pic:pic>
+              </a:graphicData>
+            </a:graphic>
+          </wp:inline>
+        </w:drawing>
+      </w:r>
+    </w:p>
+    <w:p>
+      <w:pPr>
+        <w:spacing w:after="200"/>
+        <w:jc w:val="center"/>
+      </w:pPr>
+      <w:r>
+        <w:rPr>
+          <w:i/>
+          <w:color w:val="666666"/>
+          <w:sz w:val="18"/>
+        </w:rPr>
+        <w:t xml:space="preserve">Figura 8. Historial de confirmaciones (commits) de la rama main. Captura del 23 de octubre de 2026.</w:t>
+      </w:r>
+    </w:p>
+    <w:p>
+      <w:pPr>
+        <w:keepNext/>
+        <w:spacing w:before="120"/>
+        <w:jc w:val="center"/>
+      </w:pPr>
+      <w:r>
+        <w:drawing>
+          <wp:inline xmlns:a="http://schemas.openxmlformats.org/drawingml/2006/main" xmlns:pic="http://schemas.openxmlformats.org/drawingml/2006/picture">
+            <wp:extent cx="5669280" cy="4206240"/>
+            <wp:docPr id="11" name="Picture 11"/>
+            <wp:cNvGraphicFramePr>
+              <a:graphicFrameLocks noChangeAspect="1"/>
+            </wp:cNvGraphicFramePr>
+            <a:graphic>
+              <a:graphicData uri="http://schemas.openxmlformats.org/drawingml/2006/picture">
+                <pic:pic>
+                  <pic:nvPicPr>
+                    <pic:cNvPr id="0" name="contrib_rec.png"/>
+                    <pic:cNvPicPr/>
+                  </pic:nvPicPr>
+                  <pic:blipFill>
+                    <a:blip r:embed="rId19"/>
+                    <a:stretch>
+                      <a:fillRect/>
+                    </a:stretch>
+                  </pic:blipFill>
+                  <pic:spPr>
+                    <a:xfrm>
+                      <a:off x="0" y="0"/>
+                      <a:ext cx="5669280" cy="4206240"/>
+                    </a:xfrm>
+                    <a:prstGeom prst="rect"/>
+                  </pic:spPr>
+                </pic:pic>
+              </a:graphicData>
+            </a:graphic>
+          </wp:inline>
+        </w:drawing>
+      </w:r>
+    </w:p>
+    <w:p>
+      <w:pPr>
+        <w:spacing w:after="200"/>
+        <w:jc w:val="center"/>
+      </w:pPr>
+      <w:r>
+        <w:rPr>
+          <w:i/>
+          <w:color w:val="666666"/>
+          <w:sz w:val="18"/>
+        </w:rPr>
+        <w:t xml:space="preserve">Figura 9. Participación por cuenta en la rama main (Insights → Contributors): jaimeutb (Jaime Mochen) y ccardeno5050 (Cristian David Cardeño Gulloso). La cuenta «claude» corresponde a los commits registrados como coautoría con el asistente de IA Claude. Captura del 23 de octubre de 2026.</w:t>
+      </w:r>
+    </w:p>
     <w:p>
       <w:pPr>
         <w:pStyle w:val="Heading2"/>
@@ -5941,7 +6874,7 @@
           <w:i w:val="0"/>
           <w:sz w:val="21"/>
         </w:rPr>
-        <w:t>Se recomienda un tablero tipo Kanban en Trello (o Jira/ClickUp, según disponibilidad del equipo) con las columnas: Backlog, Por hacer, En progreso, En revisión y Hecho.</w:t>
+        <w:t>El equipo usa un tablero tipo Kanban propio, el archivo tablero.html del repositorio, con las columnas Backlog, Por hacer, En progreso, En revisión y Hecho.</w:t>
       </w:r>
     </w:p>
     <w:tbl>
@@ -6028,7 +6961,7 @@
                 <w:b w:val="0"/>
                 <w:sz w:val="19"/>
               </w:rPr>
-              <w:t>[Completar — Jira / Trello / ClickUp / Taiga]</w:t>
+              <w:t>Tablero Kanban en HTML (tablero.html, en la raíz del repositorio). Muestra cada requerimiento como una tarjeta con su prioridad y su estado.</w:t>
             </w:r>
           </w:p>
         </w:tc>
@@ -6065,7 +6998,7 @@
                 <w:b w:val="0"/>
                 <w:sz w:val="19"/>
               </w:rPr>
-              <w:t>[Completar — URL con acceso para el docente]</w:t>
+              <w:t>https://github.com/jaimeutb/Project_1/blob/main/tablero.html (GitHub muestra el código: para ver el tablero, descargue el archivo y ábralo en un navegador)</w:t>
             </w:r>
           </w:p>
         </w:tc>
@@ -6139,12 +7072,67 @@
                 <w:b w:val="0"/>
                 <w:sz w:val="19"/>
               </w:rPr>
-              <w:t>[Completar — capturas del tablero mostrando tareas, prioridades y estado]</w:t>
+              <w:t>Figura 10 (tareas, prioridades y estado).</w:t>
             </w:r>
           </w:p>
         </w:tc>
       </w:tr>
     </w:tbl>
+    <w:p>
+      <w:pPr>
+        <w:keepNext/>
+        <w:spacing w:before="120"/>
+        <w:jc w:val="center"/>
+      </w:pPr>
+      <w:r>
+        <w:drawing>
+          <wp:inline xmlns:a="http://schemas.openxmlformats.org/drawingml/2006/main" xmlns:pic="http://schemas.openxmlformats.org/drawingml/2006/picture">
+            <wp:extent cx="5102352" cy="4734313"/>
+            <wp:docPr id="12" name="Picture 12"/>
+            <wp:cNvGraphicFramePr>
+              <a:graphicFrameLocks noChangeAspect="1"/>
+            </wp:cNvGraphicFramePr>
+            <a:graphic>
+              <a:graphicData uri="http://schemas.openxmlformats.org/drawingml/2006/picture">
+                <pic:pic>
+                  <pic:nvPicPr>
+                    <pic:cNvPr id="0" name="tablero_rec.png"/>
+                    <pic:cNvPicPr/>
+                  </pic:nvPicPr>
+                  <pic:blipFill>
+                    <a:blip r:embed="rId20"/>
+                    <a:stretch>
+                      <a:fillRect/>
+                    </a:stretch>
+                  </pic:blipFill>
+                  <pic:spPr>
+                    <a:xfrm>
+                      <a:off x="0" y="0"/>
+                      <a:ext cx="5102352" cy="4734313"/>
+                    </a:xfrm>
+                    <a:prstGeom prst="rect"/>
+                  </pic:spPr>
+                </pic:pic>
+              </a:graphicData>
+            </a:graphic>
+          </wp:inline>
+        </w:drawing>
+      </w:r>
+    </w:p>
+    <w:p>
+      <w:pPr>
+        <w:spacing w:after="200"/>
+        <w:jc w:val="center"/>
+      </w:pPr>
+      <w:r>
+        <w:rPr>
+          <w:i/>
+          <w:color w:val="666666"/>
+          <w:sz w:val="18"/>
+        </w:rPr>
+        <w:t xml:space="preserve">Figura 10. Tablero de gestión (tablero.html): columnas Backlog, Por hacer, En progreso, En revisión y Hecho, con la prioridad y la clasificación MoSCoW de cada requerimiento. Vista parcial: la columna «Hecho» continúa con RF-08 a RNF-07. Captura del 23 de octubre de 2026.</w:t>
+      </w:r>
+    </w:p>
     <w:p>
       <w:pPr>
         <w:pStyle w:val="Heading2"/>
@@ -6499,7 +7487,7 @@
                 <w:b w:val="0"/>
                 <w:sz w:val="19"/>
               </w:rPr>
-              <w:t>[Completar — capturas del backlog y de al menos un sprint en el tablero]</w:t>
+              <w:t>Backlog: figura 10. [Completar — captura de al menos un sprint: el tablero actual no registra sprints]</w:t>
             </w:r>
           </w:p>
         </w:tc>
@@ -6550,19 +7538,7 @@
         <w:rPr>
           <w:sz w:val="21"/>
         </w:rPr>
-        <w:t>Crear (o confirmar) el repositorio de GitHub y completar la sección 9.1 con el enlace y las capturas solicitadas.</w:t>
-      </w:r>
-    </w:p>
-    <w:p>
-      <w:pPr>
-        <w:pStyle w:val="ListBullet"/>
-        <w:spacing w:after="60"/>
-      </w:pPr>
-      <w:r>
-        <w:rPr>
-          <w:sz w:val="21"/>
-        </w:rPr>
-        <w:t>Configurar la herramienta de gestión del proyecto y completar la sección 9.2 con el enlace y las capturas del tablero.</w:t>
+        <w:t>Agregar en la sección 9.3 la evidencia de al menos un sprint en el tablero.</w:t>
       </w:r>
     </w:p>
     <w:p>

</xml_diff>